<commit_message>
docs: capturas reales en manual, renumera 1-9, sin KAN, glosario
</commit_message>
<xml_diff>
--- a/manual/manual.docx
+++ b/manual/manual.docx
@@ -10,7 +10,7 @@
           <w:color w:val="1F6E8C"/>
           <w:sz w:val="17"/>
         </w:rPr>
-        <w:t>KAN-56  ·  MANUAL DE USUARIO  ·  BORRADOR PARA REVISIÓN</w:t>
+        <w:t>MANUAL DE USUARIO</w:t>
       </w:r>
     </w:p>
     <w:p>
@@ -163,7 +163,7 @@
           <w:color w:val="1F6E8C"/>
           <w:sz w:val="20"/>
         </w:rPr>
-        <w:t xml:space="preserve">6.0  </w:t>
+        <w:t xml:space="preserve">1  </w:t>
       </w:r>
       <w:r>
         <w:rPr>
@@ -185,7 +185,7 @@
           <w:color w:val="1B2430"/>
           <w:sz w:val="21"/>
         </w:rPr>
-        <w:t>Este manual está escrito para la persona que va a usar el resultado del sistema día a día: un analista o responsable de operaciones de red, no un programador. No hace falta saber programar ni entender de modelos estadísticos para seguir estos pasos ni para leer el resultado. Donde aparece un término técnico inevitable, se explica en palabras simples la primera vez que se usa.</w:t>
+        <w:t>Este manual está escrito para la persona que va a usar el resultado del sistema día a día: un analista o responsable de operaciones de red, no un programador. No hace falta saber programar ni entender de modelos estadísticos para seguir estos pasos ni para leer el resultado. Donde aparece un término técnico inevitable, se explica en palabras simples la primera vez que se usa (ver también el glosario, sección 9).</w:t>
       </w:r>
     </w:p>
     <w:p>
@@ -199,7 +199,7 @@
           <w:color w:val="1F6E8C"/>
           <w:sz w:val="20"/>
         </w:rPr>
-        <w:t xml:space="preserve">6.1  </w:t>
+        <w:t xml:space="preserve">2  </w:t>
       </w:r>
       <w:r>
         <w:rPr>
@@ -248,7 +248,7 @@
           <w:color w:val="1F6E8C"/>
           <w:sz w:val="20"/>
         </w:rPr>
-        <w:t xml:space="preserve">6.2  </w:t>
+        <w:t xml:space="preserve">3  </w:t>
       </w:r>
       <w:r>
         <w:rPr>
@@ -572,7 +572,7 @@
           <w:color w:val="1B2430"/>
           <w:sz w:val="18"/>
         </w:rPr>
-        <w:t xml:space="preserve">  scripts/           utilidades, incluye la anonimización (6.3)</w:t>
+        <w:t xml:space="preserve">  scripts/           utilidades, incluye la anonimización (sección 4)</w:t>
         <w:br/>
       </w:r>
       <w:r>
@@ -660,64 +660,60 @@
         <w:t>db_files/ y output/ no viajan con el código en el repositorio (datos del cliente y resultados derivados): se crean localmente al ejecutar los pasos de este manual.</w:t>
       </w:r>
     </w:p>
-    <w:tbl>
-      <w:tblPr>
-        <w:tblW w:type="auto" w:w="0"/>
-        <w:jc w:val="center"/>
-        <w:tblLook w:firstColumn="1" w:firstRow="1" w:lastColumn="0" w:lastRow="0" w:noHBand="0" w:noVBand="1" w:val="04A0"/>
-      </w:tblPr>
-      <w:tblGrid>
-        <w:gridCol w:w="9632"/>
-      </w:tblGrid>
-      <w:tr>
-        <w:tc>
-          <w:tcPr>
-            <w:tcW w:type="dxa" w:w="8928"/>
-            <w:shd w:val="clear" w:fill="EEF2F4"/>
-            <w:tcBorders>
-              <w:top w:val="dashed" w:sz="8" w:color="B9C2CA"/>
-              <w:left w:val="dashed" w:sz="8" w:color="B9C2CA"/>
-              <w:bottom w:val="dashed" w:sz="8" w:color="B9C2CA"/>
-              <w:right w:val="dashed" w:sz="8" w:color="B9C2CA"/>
-            </w:tcBorders>
-          </w:tcPr>
-          <w:p>
-            <w:pPr>
-              <w:spacing w:before="320"/>
-              <w:jc w:val="center"/>
-            </w:pPr>
-            <w:r>
-              <w:rPr>
-                <w:rFonts w:ascii="Consolas" w:hAnsi="Consolas"/>
-                <w:b/>
-                <w:color w:val="1F6E8C"/>
-                <w:sz w:val="16"/>
-              </w:rPr>
-              <w:t>CAPTURA 1</w:t>
-            </w:r>
-          </w:p>
-          <w:p>
-            <w:pPr>
-              <w:spacing w:after="320"/>
-              <w:jc w:val="center"/>
-            </w:pPr>
-            <w:r>
-              <w:rPr>
-                <w:rFonts w:ascii="Segoe UI" w:hAnsi="Segoe UI"/>
-                <w:i/>
-                <w:color w:val="55606B"/>
-                <w:sz w:val="19"/>
-              </w:rPr>
-              <w:t>Explorador de archivos mostrando la estructura de carpetas db_files/ y output/ del proyecto</w:t>
-            </w:r>
-          </w:p>
-        </w:tc>
-      </w:tr>
-    </w:tbl>
     <w:p>
       <w:pPr>
-        <w:spacing w:after="80"/>
+        <w:spacing w:before="80" w:after="40"/>
+        <w:jc w:val="center"/>
       </w:pPr>
+      <w:r>
+        <w:drawing>
+          <wp:inline xmlns:a="http://schemas.openxmlformats.org/drawingml/2006/main" xmlns:pic="http://schemas.openxmlformats.org/drawingml/2006/picture">
+            <wp:extent cx="5303520" cy="2583416"/>
+            <wp:docPr id="1" name="Picture 1"/>
+            <wp:cNvGraphicFramePr>
+              <a:graphicFrameLocks noChangeAspect="1"/>
+            </wp:cNvGraphicFramePr>
+            <a:graphic>
+              <a:graphicData uri="http://schemas.openxmlformats.org/drawingml/2006/picture">
+                <pic:pic>
+                  <pic:nvPicPr>
+                    <pic:cNvPr id="0" name="01_estructura_carpetas.png"/>
+                    <pic:cNvPicPr/>
+                  </pic:nvPicPr>
+                  <pic:blipFill>
+                    <a:blip r:embed="rId9"/>
+                    <a:stretch>
+                      <a:fillRect/>
+                    </a:stretch>
+                  </pic:blipFill>
+                  <pic:spPr>
+                    <a:xfrm>
+                      <a:off x="0" y="0"/>
+                      <a:ext cx="5303520" cy="2583416"/>
+                    </a:xfrm>
+                    <a:prstGeom prst="rect"/>
+                  </pic:spPr>
+                </pic:pic>
+              </a:graphicData>
+            </a:graphic>
+          </wp:inline>
+        </w:drawing>
+      </w:r>
+    </w:p>
+    <w:p>
+      <w:pPr>
+        <w:spacing w:after="280"/>
+        <w:jc w:val="center"/>
+      </w:pPr>
+      <w:r>
+        <w:rPr>
+          <w:rFonts w:ascii="Segoe UI" w:hAnsi="Segoe UI"/>
+          <w:i/>
+          <w:color w:val="55606B"/>
+          <w:sz w:val="18"/>
+        </w:rPr>
+        <w:t>Estructura de carpetas del proyecto</w:t>
+      </w:r>
     </w:p>
     <w:p>
       <w:pPr>
@@ -730,7 +726,7 @@
           <w:color w:val="1F6E8C"/>
           <w:sz w:val="20"/>
         </w:rPr>
-        <w:t xml:space="preserve">6.3  </w:t>
+        <w:t xml:space="preserve">4  </w:t>
       </w:r>
       <w:r>
         <w:rPr>
@@ -833,67 +829,63 @@
           <w:color w:val="1B2430"/>
           <w:sz w:val="20"/>
         </w:rPr>
-        <w:t>Este paso automático cubre los casos más comunes, pero cuando el texto libre del ticket menciona a alguien de forma poco habitual o con errores de tipeo, puede no detectarlo. Por eso el cliente hizo una revisión manual adicional. Es un punto de mejora a futuro (Próximos pasos, KAN-58), no un fallo del sistema.</w:t>
+        <w:t>Este paso automático cubre los casos más comunes, pero cuando el texto libre del ticket menciona a alguien de forma poco habitual o con errores de tipeo, puede no detectarlo. Por eso el cliente hizo una revisión manual adicional. Es un punto de mejora a futuro (Próximos pasos), no un fallo del sistema.</w:t>
       </w:r>
     </w:p>
-    <w:tbl>
-      <w:tblPr>
-        <w:tblW w:type="auto" w:w="0"/>
-        <w:jc w:val="center"/>
-        <w:tblLook w:firstColumn="1" w:firstRow="1" w:lastColumn="0" w:lastRow="0" w:noHBand="0" w:noVBand="1" w:val="04A0"/>
-      </w:tblPr>
-      <w:tblGrid>
-        <w:gridCol w:w="9632"/>
-      </w:tblGrid>
-      <w:tr>
-        <w:tc>
-          <w:tcPr>
-            <w:tcW w:type="dxa" w:w="8928"/>
-            <w:shd w:val="clear" w:fill="EEF2F4"/>
-            <w:tcBorders>
-              <w:top w:val="dashed" w:sz="8" w:color="B9C2CA"/>
-              <w:left w:val="dashed" w:sz="8" w:color="B9C2CA"/>
-              <w:bottom w:val="dashed" w:sz="8" w:color="B9C2CA"/>
-              <w:right w:val="dashed" w:sz="8" w:color="B9C2CA"/>
-            </w:tcBorders>
-          </w:tcPr>
-          <w:p>
-            <w:pPr>
-              <w:spacing w:before="320"/>
-              <w:jc w:val="center"/>
-            </w:pPr>
-            <w:r>
-              <w:rPr>
-                <w:rFonts w:ascii="Consolas" w:hAnsi="Consolas"/>
-                <w:b/>
-                <w:color w:val="1F6E8C"/>
-                <w:sz w:val="16"/>
-              </w:rPr>
-              <w:t>CAPTURA 2</w:t>
-            </w:r>
-          </w:p>
-          <w:p>
-            <w:pPr>
-              <w:spacing w:after="320"/>
-              <w:jc w:val="center"/>
-            </w:pPr>
-            <w:r>
-              <w:rPr>
-                <w:rFonts w:ascii="Segoe UI" w:hAnsi="Segoe UI"/>
-                <w:i/>
-                <w:color w:val="55606B"/>
-                <w:sz w:val="19"/>
-              </w:rPr>
-              <w:t>Terminal mostrando python scripts/cleanup-data.py corriendo y el mensaje de confirmación</w:t>
-            </w:r>
-          </w:p>
-        </w:tc>
-      </w:tr>
-    </w:tbl>
     <w:p>
       <w:pPr>
-        <w:spacing w:after="80"/>
+        <w:spacing w:before="80" w:after="40"/>
+        <w:jc w:val="center"/>
       </w:pPr>
+      <w:r>
+        <w:drawing>
+          <wp:inline xmlns:a="http://schemas.openxmlformats.org/drawingml/2006/main" xmlns:pic="http://schemas.openxmlformats.org/drawingml/2006/picture">
+            <wp:extent cx="5486400" cy="2036702"/>
+            <wp:docPr id="2" name="Picture 2"/>
+            <wp:cNvGraphicFramePr>
+              <a:graphicFrameLocks noChangeAspect="1"/>
+            </wp:cNvGraphicFramePr>
+            <a:graphic>
+              <a:graphicData uri="http://schemas.openxmlformats.org/drawingml/2006/picture">
+                <pic:pic>
+                  <pic:nvPicPr>
+                    <pic:cNvPr id="0" name="02_anonimizacion_terminal.png"/>
+                    <pic:cNvPicPr/>
+                  </pic:nvPicPr>
+                  <pic:blipFill>
+                    <a:blip r:embed="rId10"/>
+                    <a:stretch>
+                      <a:fillRect/>
+                    </a:stretch>
+                  </pic:blipFill>
+                  <pic:spPr>
+                    <a:xfrm>
+                      <a:off x="0" y="0"/>
+                      <a:ext cx="5486400" cy="2036702"/>
+                    </a:xfrm>
+                    <a:prstGeom prst="rect"/>
+                  </pic:spPr>
+                </pic:pic>
+              </a:graphicData>
+            </a:graphic>
+          </wp:inline>
+        </w:drawing>
+      </w:r>
+    </w:p>
+    <w:p>
+      <w:pPr>
+        <w:spacing w:after="280"/>
+        <w:jc w:val="center"/>
+      </w:pPr>
+      <w:r>
+        <w:rPr>
+          <w:rFonts w:ascii="Segoe UI" w:hAnsi="Segoe UI"/>
+          <w:i/>
+          <w:color w:val="55606B"/>
+          <w:sz w:val="18"/>
+        </w:rPr>
+        <w:t>Corrida de demostración con datos sintéticos (el archivo real del cliente no se distribuye en el repositorio); el comando y el formato de salida son los reales.</w:t>
+      </w:r>
     </w:p>
     <w:p>
       <w:pPr>
@@ -906,7 +898,7 @@
           <w:color w:val="1F6E8C"/>
           <w:sz w:val="20"/>
         </w:rPr>
-        <w:t xml:space="preserve">6.4  </w:t>
+        <w:t xml:space="preserve">5  </w:t>
       </w:r>
       <w:r>
         <w:rPr>
@@ -1037,123 +1029,115 @@
         <w:t>Entrena el modelo con la información más reciente y calcula, para cada sitio, qué tan probable es que genere un reclamo. El resultado queda en dos archivos con la misma información: ranking_sitios.csv (para Excel/Sheets) y ranking_sitios.parquet (formato técnico).</w:t>
       </w:r>
     </w:p>
-    <w:tbl>
-      <w:tblPr>
-        <w:tblW w:type="auto" w:w="0"/>
-        <w:jc w:val="center"/>
-        <w:tblLook w:firstColumn="1" w:firstRow="1" w:lastColumn="0" w:lastRow="0" w:noHBand="0" w:noVBand="1" w:val="04A0"/>
-      </w:tblPr>
-      <w:tblGrid>
-        <w:gridCol w:w="9632"/>
-      </w:tblGrid>
-      <w:tr>
-        <w:tc>
-          <w:tcPr>
-            <w:tcW w:type="dxa" w:w="8928"/>
-            <w:shd w:val="clear" w:fill="EEF2F4"/>
-            <w:tcBorders>
-              <w:top w:val="dashed" w:sz="8" w:color="B9C2CA"/>
-              <w:left w:val="dashed" w:sz="8" w:color="B9C2CA"/>
-              <w:bottom w:val="dashed" w:sz="8" w:color="B9C2CA"/>
-              <w:right w:val="dashed" w:sz="8" w:color="B9C2CA"/>
-            </w:tcBorders>
-          </w:tcPr>
-          <w:p>
-            <w:pPr>
-              <w:spacing w:before="320"/>
-              <w:jc w:val="center"/>
-            </w:pPr>
-            <w:r>
-              <w:rPr>
-                <w:rFonts w:ascii="Consolas" w:hAnsi="Consolas"/>
-                <w:b/>
-                <w:color w:val="1F6E8C"/>
-                <w:sz w:val="16"/>
-              </w:rPr>
-              <w:t>CAPTURA 3</w:t>
-            </w:r>
-          </w:p>
-          <w:p>
-            <w:pPr>
-              <w:spacing w:after="320"/>
-              <w:jc w:val="center"/>
-            </w:pPr>
-            <w:r>
-              <w:rPr>
-                <w:rFonts w:ascii="Segoe UI" w:hAnsi="Segoe UI"/>
-                <w:i/>
-                <w:color w:val="55606B"/>
-                <w:sz w:val="19"/>
-              </w:rPr>
-              <w:t>Salida de score_sites.py: tabla resumen de los 10 sitios de mayor riesgo</w:t>
-            </w:r>
-          </w:p>
-        </w:tc>
-      </w:tr>
-    </w:tbl>
     <w:p>
       <w:pPr>
-        <w:spacing w:after="80"/>
+        <w:spacing w:before="80" w:after="40"/>
+        <w:jc w:val="center"/>
       </w:pPr>
+      <w:r>
+        <w:drawing>
+          <wp:inline xmlns:a="http://schemas.openxmlformats.org/drawingml/2006/main" xmlns:pic="http://schemas.openxmlformats.org/drawingml/2006/picture">
+            <wp:extent cx="5906087" cy="2096713"/>
+            <wp:docPr id="3" name="Picture 3"/>
+            <wp:cNvGraphicFramePr>
+              <a:graphicFrameLocks noChangeAspect="1"/>
+            </wp:cNvGraphicFramePr>
+            <a:graphic>
+              <a:graphicData uri="http://schemas.openxmlformats.org/drawingml/2006/picture">
+                <pic:pic>
+                  <pic:nvPicPr>
+                    <pic:cNvPr id="0" name="03_score_sites_terminal.png"/>
+                    <pic:cNvPicPr/>
+                  </pic:nvPicPr>
+                  <pic:blipFill>
+                    <a:blip r:embed="rId11"/>
+                    <a:stretch>
+                      <a:fillRect/>
+                    </a:stretch>
+                  </pic:blipFill>
+                  <pic:spPr>
+                    <a:xfrm>
+                      <a:off x="0" y="0"/>
+                      <a:ext cx="5906087" cy="2096713"/>
+                    </a:xfrm>
+                    <a:prstGeom prst="rect"/>
+                  </pic:spPr>
+                </pic:pic>
+              </a:graphicData>
+            </a:graphic>
+          </wp:inline>
+        </w:drawing>
+      </w:r>
     </w:p>
-    <w:tbl>
-      <w:tblPr>
-        <w:tblW w:type="auto" w:w="0"/>
-        <w:jc w:val="center"/>
-        <w:tblLook w:firstColumn="1" w:firstRow="1" w:lastColumn="0" w:lastRow="0" w:noHBand="0" w:noVBand="1" w:val="04A0"/>
-      </w:tblPr>
-      <w:tblGrid>
-        <w:gridCol w:w="9632"/>
-      </w:tblGrid>
-      <w:tr>
-        <w:tc>
-          <w:tcPr>
-            <w:tcW w:type="dxa" w:w="8928"/>
-            <w:shd w:val="clear" w:fill="EEF2F4"/>
-            <w:tcBorders>
-              <w:top w:val="dashed" w:sz="8" w:color="B9C2CA"/>
-              <w:left w:val="dashed" w:sz="8" w:color="B9C2CA"/>
-              <w:bottom w:val="dashed" w:sz="8" w:color="B9C2CA"/>
-              <w:right w:val="dashed" w:sz="8" w:color="B9C2CA"/>
-            </w:tcBorders>
-          </w:tcPr>
-          <w:p>
-            <w:pPr>
-              <w:spacing w:before="320"/>
-              <w:jc w:val="center"/>
-            </w:pPr>
-            <w:r>
-              <w:rPr>
-                <w:rFonts w:ascii="Consolas" w:hAnsi="Consolas"/>
-                <w:b/>
-                <w:color w:val="1F6E8C"/>
-                <w:sz w:val="16"/>
-              </w:rPr>
-              <w:t>CAPTURA 4</w:t>
-            </w:r>
-          </w:p>
-          <w:p>
-            <w:pPr>
-              <w:spacing w:after="320"/>
-              <w:jc w:val="center"/>
-            </w:pPr>
-            <w:r>
-              <w:rPr>
-                <w:rFonts w:ascii="Segoe UI" w:hAnsi="Segoe UI"/>
-                <w:i/>
-                <w:color w:val="55606B"/>
-                <w:sz w:val="19"/>
-              </w:rPr>
-              <w:t>ranking_sitios.csv abierto en Excel</w:t>
-            </w:r>
-          </w:p>
-        </w:tc>
-      </w:tr>
-    </w:tbl>
     <w:p>
       <w:pPr>
-        <w:spacing w:after="80"/>
+        <w:spacing w:after="280"/>
+        <w:jc w:val="center"/>
       </w:pPr>
+      <w:r>
+        <w:rPr>
+          <w:rFonts w:ascii="Segoe UI" w:hAnsi="Segoe UI"/>
+          <w:i/>
+          <w:color w:val="55606B"/>
+          <w:sz w:val="18"/>
+        </w:rPr>
+        <w:t>Salida real de score_sites.py: resumen de los 10 sitios de mayor riesgo</w:t>
+      </w:r>
+    </w:p>
+    <w:p>
+      <w:pPr>
+        <w:spacing w:before="80" w:after="40"/>
+        <w:jc w:val="center"/>
+      </w:pPr>
+      <w:r>
+        <w:drawing>
+          <wp:inline xmlns:a="http://schemas.openxmlformats.org/drawingml/2006/main" xmlns:pic="http://schemas.openxmlformats.org/drawingml/2006/picture">
+            <wp:extent cx="5669280" cy="3337801"/>
+            <wp:docPr id="4" name="Picture 4"/>
+            <wp:cNvGraphicFramePr>
+              <a:graphicFrameLocks noChangeAspect="1"/>
+            </wp:cNvGraphicFramePr>
+            <a:graphic>
+              <a:graphicData uri="http://schemas.openxmlformats.org/drawingml/2006/picture">
+                <pic:pic>
+                  <pic:nvPicPr>
+                    <pic:cNvPr id="0" name="04_ranking_csv.png"/>
+                    <pic:cNvPicPr/>
+                  </pic:nvPicPr>
+                  <pic:blipFill>
+                    <a:blip r:embed="rId12"/>
+                    <a:stretch>
+                      <a:fillRect/>
+                    </a:stretch>
+                  </pic:blipFill>
+                  <pic:spPr>
+                    <a:xfrm>
+                      <a:off x="0" y="0"/>
+                      <a:ext cx="5669280" cy="3337801"/>
+                    </a:xfrm>
+                    <a:prstGeom prst="rect"/>
+                  </pic:spPr>
+                </pic:pic>
+              </a:graphicData>
+            </a:graphic>
+          </wp:inline>
+        </w:drawing>
+      </w:r>
+    </w:p>
+    <w:p>
+      <w:pPr>
+        <w:spacing w:after="280"/>
+        <w:jc w:val="center"/>
+      </w:pPr>
+      <w:r>
+        <w:rPr>
+          <w:rFonts w:ascii="Segoe UI" w:hAnsi="Segoe UI"/>
+          <w:i/>
+          <w:color w:val="55606B"/>
+          <w:sz w:val="18"/>
+        </w:rPr>
+        <w:t>Columnas principales de ranking_sitios.csv, datos reales de la corrida más reciente</w:t>
+      </w:r>
     </w:p>
     <w:p>
       <w:pPr>
@@ -1194,7 +1178,7 @@
           <w:color w:val="1F6E8C"/>
           <w:sz w:val="20"/>
         </w:rPr>
-        <w:t xml:space="preserve">6.5  </w:t>
+        <w:t xml:space="preserve">6  </w:t>
       </w:r>
       <w:r>
         <w:rPr>
@@ -1592,7 +1576,7 @@
           <w:color w:val="1F6E8C"/>
           <w:sz w:val="20"/>
         </w:rPr>
-        <w:t xml:space="preserve">6.6  </w:t>
+        <w:t xml:space="preserve">7  </w:t>
       </w:r>
       <w:r>
         <w:rPr>
@@ -1628,67 +1612,63 @@
           <w:color w:val="1B2430"/>
           <w:sz w:val="23"/>
         </w:rPr>
-        <w:t>Importancia de cada indicador (shap_global_bar.png)</w:t>
+        <w:t>Importancia de cada indicador</w:t>
       </w:r>
     </w:p>
-    <w:tbl>
-      <w:tblPr>
-        <w:tblW w:type="auto" w:w="0"/>
-        <w:jc w:val="center"/>
-        <w:tblLook w:firstColumn="1" w:firstRow="1" w:lastColumn="0" w:lastRow="0" w:noHBand="0" w:noVBand="1" w:val="04A0"/>
-      </w:tblPr>
-      <w:tblGrid>
-        <w:gridCol w:w="9632"/>
-      </w:tblGrid>
-      <w:tr>
-        <w:tc>
-          <w:tcPr>
-            <w:tcW w:type="dxa" w:w="8928"/>
-            <w:shd w:val="clear" w:fill="EEF2F4"/>
-            <w:tcBorders>
-              <w:top w:val="dashed" w:sz="8" w:color="B9C2CA"/>
-              <w:left w:val="dashed" w:sz="8" w:color="B9C2CA"/>
-              <w:bottom w:val="dashed" w:sz="8" w:color="B9C2CA"/>
-              <w:right w:val="dashed" w:sz="8" w:color="B9C2CA"/>
-            </w:tcBorders>
-          </w:tcPr>
-          <w:p>
-            <w:pPr>
-              <w:spacing w:before="320"/>
-              <w:jc w:val="center"/>
-            </w:pPr>
-            <w:r>
-              <w:rPr>
-                <w:rFonts w:ascii="Consolas" w:hAnsi="Consolas"/>
-                <w:b/>
-                <w:color w:val="1F6E8C"/>
-                <w:sz w:val="16"/>
-              </w:rPr>
-              <w:t>CAPTURA 5</w:t>
-            </w:r>
-          </w:p>
-          <w:p>
-            <w:pPr>
-              <w:spacing w:after="320"/>
-              <w:jc w:val="center"/>
-            </w:pPr>
-            <w:r>
-              <w:rPr>
-                <w:rFonts w:ascii="Segoe UI" w:hAnsi="Segoe UI"/>
-                <w:i/>
-                <w:color w:val="55606B"/>
-                <w:sz w:val="19"/>
-              </w:rPr>
-              <w:t>Muestra, en promedio, qué tanto pesa cada indicador en la decisión del modelo</w:t>
-            </w:r>
-          </w:p>
-        </w:tc>
-      </w:tr>
-    </w:tbl>
     <w:p>
       <w:pPr>
-        <w:spacing w:after="80"/>
+        <w:spacing w:before="80" w:after="40"/>
+        <w:jc w:val="center"/>
       </w:pPr>
+      <w:r>
+        <w:drawing>
+          <wp:inline xmlns:a="http://schemas.openxmlformats.org/drawingml/2006/main" xmlns:pic="http://schemas.openxmlformats.org/drawingml/2006/picture">
+            <wp:extent cx="5303520" cy="2806532"/>
+            <wp:docPr id="5" name="Picture 5"/>
+            <wp:cNvGraphicFramePr>
+              <a:graphicFrameLocks noChangeAspect="1"/>
+            </wp:cNvGraphicFramePr>
+            <a:graphic>
+              <a:graphicData uri="http://schemas.openxmlformats.org/drawingml/2006/picture">
+                <pic:pic>
+                  <pic:nvPicPr>
+                    <pic:cNvPr id="0" name="05_shap_global_bar.png"/>
+                    <pic:cNvPicPr/>
+                  </pic:nvPicPr>
+                  <pic:blipFill>
+                    <a:blip r:embed="rId13"/>
+                    <a:stretch>
+                      <a:fillRect/>
+                    </a:stretch>
+                  </pic:blipFill>
+                  <pic:spPr>
+                    <a:xfrm>
+                      <a:off x="0" y="0"/>
+                      <a:ext cx="5303520" cy="2806532"/>
+                    </a:xfrm>
+                    <a:prstGeom prst="rect"/>
+                  </pic:spPr>
+                </pic:pic>
+              </a:graphicData>
+            </a:graphic>
+          </wp:inline>
+        </w:drawing>
+      </w:r>
+    </w:p>
+    <w:p>
+      <w:pPr>
+        <w:spacing w:after="280"/>
+        <w:jc w:val="center"/>
+      </w:pPr>
+      <w:r>
+        <w:rPr>
+          <w:rFonts w:ascii="Segoe UI" w:hAnsi="Segoe UI"/>
+          <w:i/>
+          <w:color w:val="55606B"/>
+          <w:sz w:val="18"/>
+        </w:rPr>
+        <w:t>Peso promedio de cada indicador en la decisión del modelo</w:t>
+      </w:r>
     </w:p>
     <w:p>
       <w:pPr>
@@ -1701,67 +1681,63 @@
           <w:color w:val="1B2430"/>
           <w:sz w:val="23"/>
         </w:rPr>
-        <w:t>Dirección del efecto (shap_beeswarm.png)</w:t>
+        <w:t>Dirección del efecto</w:t>
       </w:r>
     </w:p>
-    <w:tbl>
-      <w:tblPr>
-        <w:tblW w:type="auto" w:w="0"/>
-        <w:jc w:val="center"/>
-        <w:tblLook w:firstColumn="1" w:firstRow="1" w:lastColumn="0" w:lastRow="0" w:noHBand="0" w:noVBand="1" w:val="04A0"/>
-      </w:tblPr>
-      <w:tblGrid>
-        <w:gridCol w:w="9632"/>
-      </w:tblGrid>
-      <w:tr>
-        <w:tc>
-          <w:tcPr>
-            <w:tcW w:type="dxa" w:w="8928"/>
-            <w:shd w:val="clear" w:fill="EEF2F4"/>
-            <w:tcBorders>
-              <w:top w:val="dashed" w:sz="8" w:color="B9C2CA"/>
-              <w:left w:val="dashed" w:sz="8" w:color="B9C2CA"/>
-              <w:bottom w:val="dashed" w:sz="8" w:color="B9C2CA"/>
-              <w:right w:val="dashed" w:sz="8" w:color="B9C2CA"/>
-            </w:tcBorders>
-          </w:tcPr>
-          <w:p>
-            <w:pPr>
-              <w:spacing w:before="320"/>
-              <w:jc w:val="center"/>
-            </w:pPr>
-            <w:r>
-              <w:rPr>
-                <w:rFonts w:ascii="Consolas" w:hAnsi="Consolas"/>
-                <w:b/>
-                <w:color w:val="1F6E8C"/>
-                <w:sz w:val="16"/>
-              </w:rPr>
-              <w:t>CAPTURA 6</w:t>
-            </w:r>
-          </w:p>
-          <w:p>
-            <w:pPr>
-              <w:spacing w:after="320"/>
-              <w:jc w:val="center"/>
-            </w:pPr>
-            <w:r>
-              <w:rPr>
-                <w:rFonts w:ascii="Segoe UI" w:hAnsi="Segoe UI"/>
-                <w:i/>
-                <w:color w:val="55606B"/>
-                <w:sz w:val="19"/>
-              </w:rPr>
-              <w:t>Para cada indicador, muestra si valores altos o bajos empujan el riesgo hacia arriba o hacia abajo</w:t>
-            </w:r>
-          </w:p>
-        </w:tc>
-      </w:tr>
-    </w:tbl>
     <w:p>
       <w:pPr>
-        <w:spacing w:after="80"/>
+        <w:spacing w:before="80" w:after="40"/>
+        <w:jc w:val="center"/>
       </w:pPr>
+      <w:r>
+        <w:drawing>
+          <wp:inline xmlns:a="http://schemas.openxmlformats.org/drawingml/2006/main" xmlns:pic="http://schemas.openxmlformats.org/drawingml/2006/picture">
+            <wp:extent cx="5303520" cy="2554950"/>
+            <wp:docPr id="6" name="Picture 6"/>
+            <wp:cNvGraphicFramePr>
+              <a:graphicFrameLocks noChangeAspect="1"/>
+            </wp:cNvGraphicFramePr>
+            <a:graphic>
+              <a:graphicData uri="http://schemas.openxmlformats.org/drawingml/2006/picture">
+                <pic:pic>
+                  <pic:nvPicPr>
+                    <pic:cNvPr id="0" name="06_shap_beeswarm.png"/>
+                    <pic:cNvPicPr/>
+                  </pic:nvPicPr>
+                  <pic:blipFill>
+                    <a:blip r:embed="rId14"/>
+                    <a:stretch>
+                      <a:fillRect/>
+                    </a:stretch>
+                  </pic:blipFill>
+                  <pic:spPr>
+                    <a:xfrm>
+                      <a:off x="0" y="0"/>
+                      <a:ext cx="5303520" cy="2554950"/>
+                    </a:xfrm>
+                    <a:prstGeom prst="rect"/>
+                  </pic:spPr>
+                </pic:pic>
+              </a:graphicData>
+            </a:graphic>
+          </wp:inline>
+        </w:drawing>
+      </w:r>
+    </w:p>
+    <w:p>
+      <w:pPr>
+        <w:spacing w:after="280"/>
+        <w:jc w:val="center"/>
+      </w:pPr>
+      <w:r>
+        <w:rPr>
+          <w:rFonts w:ascii="Segoe UI" w:hAnsi="Segoe UI"/>
+          <w:i/>
+          <w:color w:val="55606B"/>
+          <w:sz w:val="18"/>
+        </w:rPr>
+        <w:t>Si valores altos o bajos de cada indicador empujan el riesgo hacia arriba o abajo</w:t>
+      </w:r>
     </w:p>
     <w:p>
       <w:pPr>
@@ -1774,67 +1750,63 @@
           <w:color w:val="1B2430"/>
           <w:sz w:val="23"/>
         </w:rPr>
-        <w:t>Grupos de sitios (cluster_sitios.png)</w:t>
+        <w:t>Grupos de sitios</w:t>
       </w:r>
     </w:p>
-    <w:tbl>
-      <w:tblPr>
-        <w:tblW w:type="auto" w:w="0"/>
-        <w:jc w:val="center"/>
-        <w:tblLook w:firstColumn="1" w:firstRow="1" w:lastColumn="0" w:lastRow="0" w:noHBand="0" w:noVBand="1" w:val="04A0"/>
-      </w:tblPr>
-      <w:tblGrid>
-        <w:gridCol w:w="9632"/>
-      </w:tblGrid>
-      <w:tr>
-        <w:tc>
-          <w:tcPr>
-            <w:tcW w:type="dxa" w:w="8928"/>
-            <w:shd w:val="clear" w:fill="EEF2F4"/>
-            <w:tcBorders>
-              <w:top w:val="dashed" w:sz="8" w:color="B9C2CA"/>
-              <w:left w:val="dashed" w:sz="8" w:color="B9C2CA"/>
-              <w:bottom w:val="dashed" w:sz="8" w:color="B9C2CA"/>
-              <w:right w:val="dashed" w:sz="8" w:color="B9C2CA"/>
-            </w:tcBorders>
-          </w:tcPr>
-          <w:p>
-            <w:pPr>
-              <w:spacing w:before="320"/>
-              <w:jc w:val="center"/>
-            </w:pPr>
-            <w:r>
-              <w:rPr>
-                <w:rFonts w:ascii="Consolas" w:hAnsi="Consolas"/>
-                <w:b/>
-                <w:color w:val="1F6E8C"/>
-                <w:sz w:val="16"/>
-              </w:rPr>
-              <w:t>CAPTURA 7</w:t>
-            </w:r>
-          </w:p>
-          <w:p>
-            <w:pPr>
-              <w:spacing w:after="320"/>
-              <w:jc w:val="center"/>
-            </w:pPr>
-            <w:r>
-              <w:rPr>
-                <w:rFonts w:ascii="Segoe UI" w:hAnsi="Segoe UI"/>
-                <w:i/>
-                <w:color w:val="55606B"/>
-                <w:sz w:val="19"/>
-              </w:rPr>
-              <w:t>Agrupa los sitios en perfiles con comportamiento parecido</w:t>
-            </w:r>
-          </w:p>
-        </w:tc>
-      </w:tr>
-    </w:tbl>
     <w:p>
       <w:pPr>
-        <w:spacing w:after="80"/>
+        <w:spacing w:before="80" w:after="40"/>
+        <w:jc w:val="center"/>
       </w:pPr>
+      <w:r>
+        <w:drawing>
+          <wp:inline xmlns:a="http://schemas.openxmlformats.org/drawingml/2006/main" xmlns:pic="http://schemas.openxmlformats.org/drawingml/2006/picture">
+            <wp:extent cx="5303520" cy="4730948"/>
+            <wp:docPr id="7" name="Picture 7"/>
+            <wp:cNvGraphicFramePr>
+              <a:graphicFrameLocks noChangeAspect="1"/>
+            </wp:cNvGraphicFramePr>
+            <a:graphic>
+              <a:graphicData uri="http://schemas.openxmlformats.org/drawingml/2006/picture">
+                <pic:pic>
+                  <pic:nvPicPr>
+                    <pic:cNvPr id="0" name="07_cluster_sitios.png"/>
+                    <pic:cNvPicPr/>
+                  </pic:nvPicPr>
+                  <pic:blipFill>
+                    <a:blip r:embed="rId15"/>
+                    <a:stretch>
+                      <a:fillRect/>
+                    </a:stretch>
+                  </pic:blipFill>
+                  <pic:spPr>
+                    <a:xfrm>
+                      <a:off x="0" y="0"/>
+                      <a:ext cx="5303520" cy="4730948"/>
+                    </a:xfrm>
+                    <a:prstGeom prst="rect"/>
+                  </pic:spPr>
+                </pic:pic>
+              </a:graphicData>
+            </a:graphic>
+          </wp:inline>
+        </w:drawing>
+      </w:r>
+    </w:p>
+    <w:p>
+      <w:pPr>
+        <w:spacing w:after="280"/>
+        <w:jc w:val="center"/>
+      </w:pPr>
+      <w:r>
+        <w:rPr>
+          <w:rFonts w:ascii="Segoe UI" w:hAnsi="Segoe UI"/>
+          <w:i/>
+          <w:color w:val="55606B"/>
+          <w:sz w:val="18"/>
+        </w:rPr>
+        <w:t>Sitios agrupados por perfil de comportamiento similar</w:t>
+      </w:r>
     </w:p>
     <w:p>
       <w:pPr>
@@ -1847,67 +1819,186 @@
           <w:color w:val="1B2430"/>
           <w:sz w:val="23"/>
         </w:rPr>
-        <w:t>Tasa de reclamo por umbral de indicador (eda_*_bucket.png)</w:t>
+        <w:t>Tasa de reclamo por umbral de indicador</w:t>
       </w:r>
     </w:p>
-    <w:tbl>
-      <w:tblPr>
-        <w:tblW w:type="auto" w:w="0"/>
-        <w:jc w:val="center"/>
-        <w:tblLook w:firstColumn="1" w:firstRow="1" w:lastColumn="0" w:lastRow="0" w:noHBand="0" w:noVBand="1" w:val="04A0"/>
-      </w:tblPr>
-      <w:tblGrid>
-        <w:gridCol w:w="9632"/>
-      </w:tblGrid>
-      <w:tr>
-        <w:tc>
-          <w:tcPr>
-            <w:tcW w:type="dxa" w:w="8928"/>
-            <w:shd w:val="clear" w:fill="EEF2F4"/>
-            <w:tcBorders>
-              <w:top w:val="dashed" w:sz="8" w:color="B9C2CA"/>
-              <w:left w:val="dashed" w:sz="8" w:color="B9C2CA"/>
-              <w:bottom w:val="dashed" w:sz="8" w:color="B9C2CA"/>
-              <w:right w:val="dashed" w:sz="8" w:color="B9C2CA"/>
-            </w:tcBorders>
-          </w:tcPr>
-          <w:p>
-            <w:pPr>
-              <w:spacing w:before="320"/>
-              <w:jc w:val="center"/>
-            </w:pPr>
-            <w:r>
-              <w:rPr>
-                <w:rFonts w:ascii="Consolas" w:hAnsi="Consolas"/>
-                <w:b/>
-                <w:color w:val="1F6E8C"/>
-                <w:sz w:val="16"/>
-              </w:rPr>
-              <w:t>CAPTURA 8</w:t>
-            </w:r>
-          </w:p>
-          <w:p>
-            <w:pPr>
-              <w:spacing w:after="320"/>
-              <w:jc w:val="center"/>
-            </w:pPr>
-            <w:r>
-              <w:rPr>
-                <w:rFonts w:ascii="Segoe UI" w:hAnsi="Segoe UI"/>
-                <w:i/>
-                <w:color w:val="55606B"/>
-                <w:sz w:val="19"/>
-              </w:rPr>
-              <w:t>Compara, para cada indicador, cuántos reclamos hay por encima o por debajo del umbral de referencia</w:t>
-            </w:r>
-          </w:p>
-        </w:tc>
-      </w:tr>
-    </w:tbl>
     <w:p>
       <w:pPr>
-        <w:spacing w:after="80"/>
+        <w:spacing w:before="80" w:after="40"/>
+        <w:jc w:val="center"/>
       </w:pPr>
+      <w:r>
+        <w:drawing>
+          <wp:inline xmlns:a="http://schemas.openxmlformats.org/drawingml/2006/main" xmlns:pic="http://schemas.openxmlformats.org/drawingml/2006/picture">
+            <wp:extent cx="2377440" cy="2476335"/>
+            <wp:docPr id="8" name="Picture 8"/>
+            <wp:cNvGraphicFramePr>
+              <a:graphicFrameLocks noChangeAspect="1"/>
+            </wp:cNvGraphicFramePr>
+            <a:graphic>
+              <a:graphicData uri="http://schemas.openxmlformats.org/drawingml/2006/picture">
+                <pic:pic>
+                  <pic:nvPicPr>
+                    <pic:cNvPr id="0" name="08a_eda_ava_bucket.png"/>
+                    <pic:cNvPicPr/>
+                  </pic:nvPicPr>
+                  <pic:blipFill>
+                    <a:blip r:embed="rId16"/>
+                    <a:stretch>
+                      <a:fillRect/>
+                    </a:stretch>
+                  </pic:blipFill>
+                  <pic:spPr>
+                    <a:xfrm>
+                      <a:off x="0" y="0"/>
+                      <a:ext cx="2377440" cy="2476335"/>
+                    </a:xfrm>
+                    <a:prstGeom prst="rect"/>
+                  </pic:spPr>
+                </pic:pic>
+              </a:graphicData>
+            </a:graphic>
+          </wp:inline>
+        </w:drawing>
+      </w:r>
+    </w:p>
+    <w:p>
+      <w:pPr>
+        <w:spacing w:after="280"/>
+        <w:jc w:val="center"/>
+      </w:pPr>
+      <w:r>
+        <w:rPr>
+          <w:rFonts w:ascii="Segoe UI" w:hAnsi="Segoe UI"/>
+          <w:i/>
+          <w:color w:val="55606B"/>
+          <w:sz w:val="18"/>
+        </w:rPr>
+        <w:t>Disponibilidad (AVA_4G)</w:t>
+      </w:r>
+    </w:p>
+    <w:p>
+      <w:pPr>
+        <w:spacing w:before="80" w:after="40"/>
+        <w:jc w:val="center"/>
+      </w:pPr>
+      <w:r>
+        <w:drawing>
+          <wp:inline xmlns:a="http://schemas.openxmlformats.org/drawingml/2006/main" xmlns:pic="http://schemas.openxmlformats.org/drawingml/2006/picture">
+            <wp:extent cx="2377440" cy="2464036"/>
+            <wp:docPr id="9" name="Picture 9"/>
+            <wp:cNvGraphicFramePr>
+              <a:graphicFrameLocks noChangeAspect="1"/>
+            </wp:cNvGraphicFramePr>
+            <a:graphic>
+              <a:graphicData uri="http://schemas.openxmlformats.org/drawingml/2006/picture">
+                <pic:pic>
+                  <pic:nvPicPr>
+                    <pic:cNvPr id="0" name="08b_eda_dc_bucket.png"/>
+                    <pic:cNvPicPr/>
+                  </pic:nvPicPr>
+                  <pic:blipFill>
+                    <a:blip r:embed="rId17"/>
+                    <a:stretch>
+                      <a:fillRect/>
+                    </a:stretch>
+                  </pic:blipFill>
+                  <pic:spPr>
+                    <a:xfrm>
+                      <a:off x="0" y="0"/>
+                      <a:ext cx="2377440" cy="2464036"/>
+                    </a:xfrm>
+                    <a:prstGeom prst="rect"/>
+                  </pic:spPr>
+                </pic:pic>
+              </a:graphicData>
+            </a:graphic>
+          </wp:inline>
+        </w:drawing>
+      </w:r>
+    </w:p>
+    <w:p>
+      <w:pPr>
+        <w:spacing w:after="280"/>
+        <w:jc w:val="center"/>
+      </w:pPr>
+      <w:r>
+        <w:rPr>
+          <w:rFonts w:ascii="Segoe UI" w:hAnsi="Segoe UI"/>
+          <w:i/>
+          <w:color w:val="55606B"/>
+          <w:sz w:val="18"/>
+        </w:rPr>
+        <w:t>Caídas de llamada (DC_V4G)</w:t>
+      </w:r>
+    </w:p>
+    <w:p>
+      <w:pPr>
+        <w:spacing w:before="80" w:after="40"/>
+        <w:jc w:val="center"/>
+      </w:pPr>
+      <w:r>
+        <w:drawing>
+          <wp:inline xmlns:a="http://schemas.openxmlformats.org/drawingml/2006/main" xmlns:pic="http://schemas.openxmlformats.org/drawingml/2006/picture">
+            <wp:extent cx="2377440" cy="2329072"/>
+            <wp:docPr id="10" name="Picture 10"/>
+            <wp:cNvGraphicFramePr>
+              <a:graphicFrameLocks noChangeAspect="1"/>
+            </wp:cNvGraphicFramePr>
+            <a:graphic>
+              <a:graphicData uri="http://schemas.openxmlformats.org/drawingml/2006/picture">
+                <pic:pic>
+                  <pic:nvPicPr>
+                    <pic:cNvPr id="0" name="08c_eda_thp_bucket.png"/>
+                    <pic:cNvPicPr/>
+                  </pic:nvPicPr>
+                  <pic:blipFill>
+                    <a:blip r:embed="rId18"/>
+                    <a:stretch>
+                      <a:fillRect/>
+                    </a:stretch>
+                  </pic:blipFill>
+                  <pic:spPr>
+                    <a:xfrm>
+                      <a:off x="0" y="0"/>
+                      <a:ext cx="2377440" cy="2329072"/>
+                    </a:xfrm>
+                    <a:prstGeom prst="rect"/>
+                  </pic:spPr>
+                </pic:pic>
+              </a:graphicData>
+            </a:graphic>
+          </wp:inline>
+        </w:drawing>
+      </w:r>
+    </w:p>
+    <w:p>
+      <w:pPr>
+        <w:spacing w:after="280"/>
+        <w:jc w:val="center"/>
+      </w:pPr>
+      <w:r>
+        <w:rPr>
+          <w:rFonts w:ascii="Segoe UI" w:hAnsi="Segoe UI"/>
+          <w:i/>
+          <w:color w:val="55606B"/>
+          <w:sz w:val="18"/>
+        </w:rPr>
+        <w:t>Velocidad (THROUGHPUT_4G)</w:t>
+      </w:r>
+    </w:p>
+    <w:p>
+      <w:pPr>
+        <w:spacing w:after="160"/>
+      </w:pPr>
+      <w:r>
+        <w:rPr>
+          <w:rFonts w:ascii="Segoe UI" w:hAnsi="Segoe UI"/>
+          <w:color w:val="55606B"/>
+          <w:sz w:val="19"/>
+        </w:rPr>
+        <w:t>Comparan, para cada indicador, cuántos reclamos hay por encima o por debajo del umbral de referencia. Es la evidencia detrás de los umbrales de negocio usados en el resto del sistema.</w:t>
+      </w:r>
     </w:p>
     <w:p>
       <w:pPr>
@@ -1920,7 +2011,7 @@
           <w:color w:val="1F6E8C"/>
           <w:sz w:val="20"/>
         </w:rPr>
-        <w:t xml:space="preserve">6.7  </w:t>
+        <w:t xml:space="preserve">8  </w:t>
       </w:r>
       <w:r>
         <w:rPr>
@@ -2240,6 +2331,466 @@
     </w:p>
     <w:p>
       <w:pPr>
+        <w:spacing w:before="400" w:after="120"/>
+      </w:pPr>
+      <w:r>
+        <w:rPr>
+          <w:rFonts w:ascii="Consolas" w:hAnsi="Consolas"/>
+          <w:b/>
+          <w:color w:val="1F6E8C"/>
+          <w:sz w:val="20"/>
+        </w:rPr>
+        <w:t xml:space="preserve">9  </w:t>
+      </w:r>
+      <w:r>
+        <w:rPr>
+          <w:rFonts w:ascii="Cambria" w:hAnsi="Cambria"/>
+          <w:b/>
+          <w:color w:val="1B2430"/>
+          <w:sz w:val="32"/>
+        </w:rPr>
+        <w:t>Glosario</w:t>
+      </w:r>
+    </w:p>
+    <w:tbl>
+      <w:tblPr>
+        <w:tblStyle w:val="TableGrid"/>
+        <w:tblW w:type="auto" w:w="0"/>
+        <w:jc w:val="center"/>
+        <w:tblLook w:firstColumn="1" w:firstRow="1" w:lastColumn="0" w:lastRow="0" w:noHBand="0" w:noVBand="1" w:val="04A0"/>
+      </w:tblPr>
+      <w:tblGrid>
+        <w:gridCol w:w="4816"/>
+        <w:gridCol w:w="4816"/>
+      </w:tblGrid>
+      <w:tr>
+        <w:tc>
+          <w:tcPr>
+            <w:tcW w:type="dxa" w:w="2592"/>
+            <w:shd w:val="clear" w:fill="E4EEF2"/>
+          </w:tcPr>
+          <w:p>
+            <w:r>
+              <w:rPr>
+                <w:rFonts w:ascii="Consolas" w:hAnsi="Consolas"/>
+                <w:b/>
+                <w:color w:val="155569"/>
+                <w:sz w:val="16"/>
+              </w:rPr>
+              <w:t>Término</w:t>
+            </w:r>
+          </w:p>
+        </w:tc>
+        <w:tc>
+          <w:tcPr>
+            <w:tcW w:type="dxa" w:w="6336"/>
+            <w:shd w:val="clear" w:fill="E4EEF2"/>
+          </w:tcPr>
+          <w:p>
+            <w:r>
+              <w:rPr>
+                <w:rFonts w:ascii="Consolas" w:hAnsi="Consolas"/>
+                <w:b/>
+                <w:color w:val="155569"/>
+                <w:sz w:val="16"/>
+              </w:rPr>
+              <w:t>Qué significa</w:t>
+            </w:r>
+          </w:p>
+        </w:tc>
+      </w:tr>
+      <w:tr>
+        <w:tc>
+          <w:tcPr>
+            <w:tcW w:type="dxa" w:w="2592"/>
+          </w:tcPr>
+          <w:p>
+            <w:r>
+              <w:rPr>
+                <w:rFonts w:ascii="Segoe UI" w:hAnsi="Segoe UI"/>
+                <w:color w:val="1B2430"/>
+                <w:sz w:val="19"/>
+              </w:rPr>
+              <w:t>Sitio</w:t>
+            </w:r>
+          </w:p>
+        </w:tc>
+        <w:tc>
+          <w:tcPr>
+            <w:tcW w:type="dxa" w:w="6336"/>
+          </w:tcPr>
+          <w:p>
+            <w:r>
+              <w:rPr>
+                <w:rFonts w:ascii="Segoe UI" w:hAnsi="Segoe UI"/>
+                <w:color w:val="1B2430"/>
+                <w:sz w:val="19"/>
+              </w:rPr>
+              <w:t>Antena o estación de la red móvil</w:t>
+            </w:r>
+          </w:p>
+        </w:tc>
+      </w:tr>
+      <w:tr>
+        <w:tc>
+          <w:tcPr>
+            <w:tcW w:type="dxa" w:w="2592"/>
+          </w:tcPr>
+          <w:p>
+            <w:r>
+              <w:rPr>
+                <w:rFonts w:ascii="Segoe UI" w:hAnsi="Segoe UI"/>
+                <w:color w:val="1B2430"/>
+                <w:sz w:val="19"/>
+              </w:rPr>
+              <w:t>Reclamo</w:t>
+            </w:r>
+          </w:p>
+        </w:tc>
+        <w:tc>
+          <w:tcPr>
+            <w:tcW w:type="dxa" w:w="6336"/>
+          </w:tcPr>
+          <w:p>
+            <w:r>
+              <w:rPr>
+                <w:rFonts w:ascii="Segoe UI" w:hAnsi="Segoe UI"/>
+                <w:color w:val="1B2430"/>
+                <w:sz w:val="19"/>
+              </w:rPr>
+              <w:t>Queja del cliente registrada en el sistema de atención (ticket)</w:t>
+            </w:r>
+          </w:p>
+        </w:tc>
+      </w:tr>
+      <w:tr>
+        <w:tc>
+          <w:tcPr>
+            <w:tcW w:type="dxa" w:w="2592"/>
+          </w:tcPr>
+          <w:p>
+            <w:r>
+              <w:rPr>
+                <w:rFonts w:ascii="Segoe UI" w:hAnsi="Segoe UI"/>
+                <w:color w:val="1B2430"/>
+                <w:sz w:val="19"/>
+              </w:rPr>
+              <w:t>KPI / indicador de red</w:t>
+            </w:r>
+          </w:p>
+        </w:tc>
+        <w:tc>
+          <w:tcPr>
+            <w:tcW w:type="dxa" w:w="6336"/>
+          </w:tcPr>
+          <w:p>
+            <w:r>
+              <w:rPr>
+                <w:rFonts w:ascii="Segoe UI" w:hAnsi="Segoe UI"/>
+                <w:color w:val="1B2430"/>
+                <w:sz w:val="19"/>
+              </w:rPr>
+              <w:t>Medida técnica de la calidad de servicio de un sitio, por ejemplo disponibilidad o velocidad</w:t>
+            </w:r>
+          </w:p>
+        </w:tc>
+      </w:tr>
+      <w:tr>
+        <w:tc>
+          <w:tcPr>
+            <w:tcW w:type="dxa" w:w="2592"/>
+          </w:tcPr>
+          <w:p>
+            <w:r>
+              <w:rPr>
+                <w:rFonts w:ascii="Segoe UI" w:hAnsi="Segoe UI"/>
+                <w:color w:val="1B2430"/>
+                <w:sz w:val="19"/>
+              </w:rPr>
+              <w:t>Disponibilidad (AVA_4G)</w:t>
+            </w:r>
+          </w:p>
+        </w:tc>
+        <w:tc>
+          <w:tcPr>
+            <w:tcW w:type="dxa" w:w="6336"/>
+          </w:tcPr>
+          <w:p>
+            <w:r>
+              <w:rPr>
+                <w:rFonts w:ascii="Segoe UI" w:hAnsi="Segoe UI"/>
+                <w:color w:val="1B2430"/>
+                <w:sz w:val="19"/>
+              </w:rPr>
+              <w:t>Porcentaje de tiempo que el sitio estuvo operativo, sin cortes</w:t>
+            </w:r>
+          </w:p>
+        </w:tc>
+      </w:tr>
+      <w:tr>
+        <w:tc>
+          <w:tcPr>
+            <w:tcW w:type="dxa" w:w="2592"/>
+          </w:tcPr>
+          <w:p>
+            <w:r>
+              <w:rPr>
+                <w:rFonts w:ascii="Segoe UI" w:hAnsi="Segoe UI"/>
+                <w:color w:val="1B2430"/>
+                <w:sz w:val="19"/>
+              </w:rPr>
+              <w:t>Velocidad (THROUGHPUT_4G)</w:t>
+            </w:r>
+          </w:p>
+        </w:tc>
+        <w:tc>
+          <w:tcPr>
+            <w:tcW w:type="dxa" w:w="6336"/>
+          </w:tcPr>
+          <w:p>
+            <w:r>
+              <w:rPr>
+                <w:rFonts w:ascii="Segoe UI" w:hAnsi="Segoe UI"/>
+                <w:color w:val="1B2430"/>
+                <w:sz w:val="19"/>
+              </w:rPr>
+              <w:t>Velocidad de transferencia de datos que entrega el sitio, medida en Mbps</w:t>
+            </w:r>
+          </w:p>
+        </w:tc>
+      </w:tr>
+      <w:tr>
+        <w:tc>
+          <w:tcPr>
+            <w:tcW w:type="dxa" w:w="2592"/>
+          </w:tcPr>
+          <w:p>
+            <w:r>
+              <w:rPr>
+                <w:rFonts w:ascii="Segoe UI" w:hAnsi="Segoe UI"/>
+                <w:color w:val="1B2430"/>
+                <w:sz w:val="19"/>
+              </w:rPr>
+              <w:t>Score de riesgo</w:t>
+            </w:r>
+          </w:p>
+        </w:tc>
+        <w:tc>
+          <w:tcPr>
+            <w:tcW w:type="dxa" w:w="6336"/>
+          </w:tcPr>
+          <w:p>
+            <w:r>
+              <w:rPr>
+                <w:rFonts w:ascii="Segoe UI" w:hAnsi="Segoe UI"/>
+                <w:color w:val="1B2430"/>
+                <w:sz w:val="19"/>
+              </w:rPr>
+              <w:t>Número entre 0 y 1 que estima qué tan probable es que un sitio genere un reclamo próximamente</w:t>
+            </w:r>
+          </w:p>
+        </w:tc>
+      </w:tr>
+      <w:tr>
+        <w:tc>
+          <w:tcPr>
+            <w:tcW w:type="dxa" w:w="2592"/>
+          </w:tcPr>
+          <w:p>
+            <w:r>
+              <w:rPr>
+                <w:rFonts w:ascii="Segoe UI" w:hAnsi="Segoe UI"/>
+                <w:color w:val="1B2430"/>
+                <w:sz w:val="19"/>
+              </w:rPr>
+              <w:t>Driver</w:t>
+            </w:r>
+          </w:p>
+        </w:tc>
+        <w:tc>
+          <w:tcPr>
+            <w:tcW w:type="dxa" w:w="6336"/>
+          </w:tcPr>
+          <w:p>
+            <w:r>
+              <w:rPr>
+                <w:rFonts w:ascii="Segoe UI" w:hAnsi="Segoe UI"/>
+                <w:color w:val="1B2430"/>
+                <w:sz w:val="19"/>
+              </w:rPr>
+              <w:t>El indicador de red que más explica por qué un sitio tiene el score de riesgo que tiene</w:t>
+            </w:r>
+          </w:p>
+        </w:tc>
+      </w:tr>
+      <w:tr>
+        <w:tc>
+          <w:tcPr>
+            <w:tcW w:type="dxa" w:w="2592"/>
+          </w:tcPr>
+          <w:p>
+            <w:r>
+              <w:rPr>
+                <w:rFonts w:ascii="Segoe UI" w:hAnsi="Segoe UI"/>
+                <w:color w:val="1B2430"/>
+                <w:sz w:val="19"/>
+              </w:rPr>
+              <w:t>Umbral</w:t>
+            </w:r>
+          </w:p>
+        </w:tc>
+        <w:tc>
+          <w:tcPr>
+            <w:tcW w:type="dxa" w:w="6336"/>
+          </w:tcPr>
+          <w:p>
+            <w:r>
+              <w:rPr>
+                <w:rFonts w:ascii="Segoe UI" w:hAnsi="Segoe UI"/>
+                <w:color w:val="1B2430"/>
+                <w:sz w:val="19"/>
+              </w:rPr>
+              <w:t>Valor de referencia de negocio que, al incumplirse, señala un problema</w:t>
+            </w:r>
+          </w:p>
+        </w:tc>
+      </w:tr>
+      <w:tr>
+        <w:tc>
+          <w:tcPr>
+            <w:tcW w:type="dxa" w:w="2592"/>
+          </w:tcPr>
+          <w:p>
+            <w:r>
+              <w:rPr>
+                <w:rFonts w:ascii="Segoe UI" w:hAnsi="Segoe UI"/>
+                <w:color w:val="1B2430"/>
+                <w:sz w:val="19"/>
+              </w:rPr>
+              <w:t>Cluster / perfil</w:t>
+            </w:r>
+          </w:p>
+        </w:tc>
+        <w:tc>
+          <w:tcPr>
+            <w:tcW w:type="dxa" w:w="6336"/>
+          </w:tcPr>
+          <w:p>
+            <w:r>
+              <w:rPr>
+                <w:rFonts w:ascii="Segoe UI" w:hAnsi="Segoe UI"/>
+                <w:color w:val="1B2430"/>
+                <w:sz w:val="19"/>
+              </w:rPr>
+              <w:t>Grupo de sitios con comportamiento similar, con una etiqueta que describe ese comportamiento</w:t>
+            </w:r>
+          </w:p>
+        </w:tc>
+      </w:tr>
+      <w:tr>
+        <w:tc>
+          <w:tcPr>
+            <w:tcW w:type="dxa" w:w="2592"/>
+          </w:tcPr>
+          <w:p>
+            <w:r>
+              <w:rPr>
+                <w:rFonts w:ascii="Segoe UI" w:hAnsi="Segoe UI"/>
+                <w:color w:val="1B2430"/>
+                <w:sz w:val="19"/>
+              </w:rPr>
+              <w:t>Ranking</w:t>
+            </w:r>
+          </w:p>
+        </w:tc>
+        <w:tc>
+          <w:tcPr>
+            <w:tcW w:type="dxa" w:w="6336"/>
+          </w:tcPr>
+          <w:p>
+            <w:r>
+              <w:rPr>
+                <w:rFonts w:ascii="Segoe UI" w:hAnsi="Segoe UI"/>
+                <w:color w:val="1B2430"/>
+                <w:sz w:val="19"/>
+              </w:rPr>
+              <w:t>Lista de sitios ordenada de mayor a menor riesgo</w:t>
+            </w:r>
+          </w:p>
+        </w:tc>
+      </w:tr>
+      <w:tr>
+        <w:tc>
+          <w:tcPr>
+            <w:tcW w:type="dxa" w:w="2592"/>
+          </w:tcPr>
+          <w:p>
+            <w:r>
+              <w:rPr>
+                <w:rFonts w:ascii="Segoe UI" w:hAnsi="Segoe UI"/>
+                <w:color w:val="1B2430"/>
+                <w:sz w:val="19"/>
+              </w:rPr>
+              <w:t>Modelo</w:t>
+            </w:r>
+          </w:p>
+        </w:tc>
+        <w:tc>
+          <w:tcPr>
+            <w:tcW w:type="dxa" w:w="6336"/>
+          </w:tcPr>
+          <w:p>
+            <w:r>
+              <w:rPr>
+                <w:rFonts w:ascii="Segoe UI" w:hAnsi="Segoe UI"/>
+                <w:color w:val="1B2430"/>
+                <w:sz w:val="19"/>
+              </w:rPr>
+              <w:t>Programa que aprende patrones de los datos históricos para estimar el score de riesgo (en este proyecto, XGBoost)</w:t>
+            </w:r>
+          </w:p>
+        </w:tc>
+      </w:tr>
+      <w:tr>
+        <w:tc>
+          <w:tcPr>
+            <w:tcW w:type="dxa" w:w="2592"/>
+          </w:tcPr>
+          <w:p>
+            <w:r>
+              <w:rPr>
+                <w:rFonts w:ascii="Segoe UI" w:hAnsi="Segoe UI"/>
+                <w:color w:val="1B2430"/>
+                <w:sz w:val="19"/>
+              </w:rPr>
+              <w:t>Anonimización</w:t>
+            </w:r>
+          </w:p>
+        </w:tc>
+        <w:tc>
+          <w:tcPr>
+            <w:tcW w:type="dxa" w:w="6336"/>
+          </w:tcPr>
+          <w:p>
+            <w:r>
+              <w:rPr>
+                <w:rFonts w:ascii="Segoe UI" w:hAnsi="Segoe UI"/>
+                <w:color w:val="1B2430"/>
+                <w:sz w:val="19"/>
+              </w:rPr>
+              <w:t>Proceso de quitar o reemplazar datos personales antes de analizar la información</w:t>
+            </w:r>
+          </w:p>
+        </w:tc>
+      </w:tr>
+    </w:tbl>
+    <w:p>
+      <w:pPr>
+        <w:spacing w:after="80"/>
+      </w:pPr>
+    </w:p>
+    <w:p>
+      <w:pPr>
         <w:spacing w:before="400"/>
       </w:pPr>
       <w:r>
@@ -2248,7 +2799,7 @@
           <w:color w:val="8994A0"/>
           <w:sz w:val="16"/>
         </w:rPr>
-        <w:t>Manual de usuario · KAN-56 · TFM Grupo 1</w:t>
+        <w:t>Manual de usuario · Diagnóstico de calidad de red · TFM Grupo 1</w:t>
       </w:r>
     </w:p>
     <w:sectPr>

</xml_diff>